<commit_message>
The project is ready | needed some improvments at the extarction of the applicant infos step
</commit_message>
<xml_diff>
--- a/static/src/docx/dca_alten_template.docx
+++ b/static/src/docx/dca_alten_template.docx
@@ -38,6 +38,7 @@
             <w:r>
               <w:rPr>
                 <w:noProof/>
+                <w:lang w:val="fr-FR"/>
               </w:rPr>
               <w:drawing>
                 <wp:inline distT="0" distB="0" distL="0" distR="0" wp14:anchorId="7700487D" wp14:editId="40CC3DFF">
@@ -88,21 +89,19 @@
                 </wp:inline>
               </w:drawing>
             </w:r>
-            <w:bookmarkStart w:id="0" w:name="_GoBack"/>
+          </w:p>
+        </w:tc>
+        <w:tc>
+          <w:tcPr>
+            <w:tcW w:w="747" w:type="pct"/>
+            <w:vAlign w:val="center"/>
+          </w:tcPr>
+          <w:p>
+            <w:pPr>
+              <w:pStyle w:val="Consultant"/>
+            </w:pPr>
+            <w:bookmarkStart w:id="0" w:name="LOGO"/>
             <w:bookmarkEnd w:id="0"/>
-          </w:p>
-        </w:tc>
-        <w:tc>
-          <w:tcPr>
-            <w:tcW w:w="747" w:type="pct"/>
-            <w:vAlign w:val="center"/>
-          </w:tcPr>
-          <w:p>
-            <w:pPr>
-              <w:pStyle w:val="Consultant"/>
-            </w:pPr>
-            <w:bookmarkStart w:id="1" w:name="LOGO"/>
-            <w:bookmarkEnd w:id="1"/>
           </w:p>
         </w:tc>
       </w:tr>
@@ -285,7 +284,7 @@
               </wp:anchor>
             </w:drawing>
           </mc:Choice>
-          <mc:Fallback xmlns:cx="http://schemas.microsoft.com/office/drawing/2014/chartex" xmlns:cx1="http://schemas.microsoft.com/office/drawing/2015/9/8/chartex" xmlns:cx2="http://schemas.microsoft.com/office/drawing/2015/10/21/chartex" xmlns:cx3="http://schemas.microsoft.com/office/drawing/2016/5/9/chartex" xmlns:cx4="http://schemas.microsoft.com/office/drawing/2016/5/10/chartex" xmlns:cx5="http://schemas.microsoft.com/office/drawing/2016/5/11/chartex" xmlns:cx6="http://schemas.microsoft.com/office/drawing/2016/5/12/chartex" xmlns:cx7="http://schemas.microsoft.com/office/drawing/2016/5/13/chartex" xmlns:cx8="http://schemas.microsoft.com/office/drawing/2016/5/14/chartex" xmlns:aink="http://schemas.microsoft.com/office/drawing/2016/ink" xmlns:am3d="http://schemas.microsoft.com/office/drawing/2017/model3d" xmlns:w16cex="http://schemas.microsoft.com/office/word/2018/wordml/cex" xmlns:w16cid="http://schemas.microsoft.com/office/word/2016/wordml/cid" xmlns:w16="http://schemas.microsoft.com/office/word/2018/wordml" xmlns:w16sdtdh="http://schemas.microsoft.com/office/word/2020/wordml/sdtdatahash" xmlns:w16se="http://schemas.microsoft.com/office/word/2015/wordml/symex" xmlns:a="http://schemas.openxmlformats.org/drawingml/2006/main" xmlns:a14="http://schemas.microsoft.com/office/drawing/2010/main" xmlns:w16sdtfl="http://schemas.microsoft.com/office/word/2024/wordml/sdtformatlock" xmlns:w16du="http://schemas.microsoft.com/office/word/2023/wordml/word16du" xmlns:oel="http://schemas.microsoft.com/office/2019/extlst">
+          <mc:Fallback xmlns:oel="http://schemas.microsoft.com/office/2019/extlst" xmlns:w16du="http://schemas.microsoft.com/office/word/2023/wordml/word16du" xmlns:w16sdtfl="http://schemas.microsoft.com/office/word/2024/wordml/sdtformatlock" xmlns:a14="http://schemas.microsoft.com/office/drawing/2010/main" xmlns:a="http://schemas.openxmlformats.org/drawingml/2006/main" xmlns:w16se="http://schemas.microsoft.com/office/word/2015/wordml/symex" xmlns:w16sdtdh="http://schemas.microsoft.com/office/word/2020/wordml/sdtdatahash" xmlns:w16="http://schemas.microsoft.com/office/word/2018/wordml" xmlns:w16cid="http://schemas.microsoft.com/office/word/2016/wordml/cid" xmlns:w16cex="http://schemas.microsoft.com/office/word/2018/wordml/cex" xmlns:am3d="http://schemas.microsoft.com/office/drawing/2017/model3d" xmlns:aink="http://schemas.microsoft.com/office/drawing/2016/ink" xmlns:cx8="http://schemas.microsoft.com/office/drawing/2016/5/14/chartex" xmlns:cx7="http://schemas.microsoft.com/office/drawing/2016/5/13/chartex" xmlns:cx6="http://schemas.microsoft.com/office/drawing/2016/5/12/chartex" xmlns:cx5="http://schemas.microsoft.com/office/drawing/2016/5/11/chartex" xmlns:cx4="http://schemas.microsoft.com/office/drawing/2016/5/10/chartex" xmlns:cx3="http://schemas.microsoft.com/office/drawing/2016/5/9/chartex" xmlns:cx2="http://schemas.microsoft.com/office/drawing/2015/10/21/chartex" xmlns:cx1="http://schemas.microsoft.com/office/drawing/2015/9/8/chartex" xmlns:cx="http://schemas.microsoft.com/office/drawing/2014/chartex">
             <w:pict>
               <v:group id="Zone de dessin 6" style="position:absolute;margin-left:.1pt;margin-top:4pt;width:496.15pt;height:14.85pt;z-index:-251657216" coordsize="63011,1885" o:spid="_x0000_s1026" editas="canvas" w14:anchorId="316664EE" o:gfxdata="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">
                 <v:shape id="_x0000_s1027" style="position:absolute;width:63011;height:1885;visibility:visible;mso-wrap-style:square" type="#_x0000_t75">
@@ -316,10 +315,10 @@
         </w:rPr>
         <w:t>O</w:t>
       </w:r>
-      <w:bookmarkStart w:id="2" w:name="COMPETENCE_ROW"/>
-      <w:bookmarkStart w:id="3" w:name="COMPETENCE_DETAILS_ROW"/>
+      <w:bookmarkStart w:id="1" w:name="COMPETENCE_ROW"/>
+      <w:bookmarkStart w:id="2" w:name="COMPETENCE_DETAILS_ROW"/>
+      <w:bookmarkEnd w:id="1"/>
       <w:bookmarkEnd w:id="2"/>
-      <w:bookmarkEnd w:id="3"/>
     </w:p>
     <w:p/>
     <w:tbl>
@@ -819,7 +818,7 @@
               </wp:anchor>
             </w:drawing>
           </mc:Choice>
-          <mc:Fallback xmlns:cx="http://schemas.microsoft.com/office/drawing/2014/chartex" xmlns:cx1="http://schemas.microsoft.com/office/drawing/2015/9/8/chartex" xmlns:cx2="http://schemas.microsoft.com/office/drawing/2015/10/21/chartex" xmlns:cx3="http://schemas.microsoft.com/office/drawing/2016/5/9/chartex" xmlns:cx4="http://schemas.microsoft.com/office/drawing/2016/5/10/chartex" xmlns:cx5="http://schemas.microsoft.com/office/drawing/2016/5/11/chartex" xmlns:cx6="http://schemas.microsoft.com/office/drawing/2016/5/12/chartex" xmlns:cx7="http://schemas.microsoft.com/office/drawing/2016/5/13/chartex" xmlns:cx8="http://schemas.microsoft.com/office/drawing/2016/5/14/chartex" xmlns:aink="http://schemas.microsoft.com/office/drawing/2016/ink" xmlns:am3d="http://schemas.microsoft.com/office/drawing/2017/model3d" xmlns:w16cex="http://schemas.microsoft.com/office/word/2018/wordml/cex" xmlns:w16cid="http://schemas.microsoft.com/office/word/2016/wordml/cid" xmlns:w16="http://schemas.microsoft.com/office/word/2018/wordml" xmlns:w16sdtdh="http://schemas.microsoft.com/office/word/2020/wordml/sdtdatahash" xmlns:w16se="http://schemas.microsoft.com/office/word/2015/wordml/symex" xmlns:a="http://schemas.openxmlformats.org/drawingml/2006/main" xmlns:a14="http://schemas.microsoft.com/office/drawing/2010/main" xmlns:w16sdtfl="http://schemas.microsoft.com/office/word/2024/wordml/sdtformatlock" xmlns:w16du="http://schemas.microsoft.com/office/word/2023/wordml/word16du" xmlns:oel="http://schemas.microsoft.com/office/2019/extlst">
+          <mc:Fallback xmlns:oel="http://schemas.microsoft.com/office/2019/extlst" xmlns:w16du="http://schemas.microsoft.com/office/word/2023/wordml/word16du" xmlns:w16sdtfl="http://schemas.microsoft.com/office/word/2024/wordml/sdtformatlock" xmlns:a14="http://schemas.microsoft.com/office/drawing/2010/main" xmlns:a="http://schemas.openxmlformats.org/drawingml/2006/main" xmlns:w16se="http://schemas.microsoft.com/office/word/2015/wordml/symex" xmlns:w16sdtdh="http://schemas.microsoft.com/office/word/2020/wordml/sdtdatahash" xmlns:w16="http://schemas.microsoft.com/office/word/2018/wordml" xmlns:w16cid="http://schemas.microsoft.com/office/word/2016/wordml/cid" xmlns:w16cex="http://schemas.microsoft.com/office/word/2018/wordml/cex" xmlns:am3d="http://schemas.microsoft.com/office/drawing/2017/model3d" xmlns:aink="http://schemas.microsoft.com/office/drawing/2016/ink" xmlns:cx8="http://schemas.microsoft.com/office/drawing/2016/5/14/chartex" xmlns:cx7="http://schemas.microsoft.com/office/drawing/2016/5/13/chartex" xmlns:cx6="http://schemas.microsoft.com/office/drawing/2016/5/12/chartex" xmlns:cx5="http://schemas.microsoft.com/office/drawing/2016/5/11/chartex" xmlns:cx4="http://schemas.microsoft.com/office/drawing/2016/5/10/chartex" xmlns:cx3="http://schemas.microsoft.com/office/drawing/2016/5/9/chartex" xmlns:cx2="http://schemas.microsoft.com/office/drawing/2015/10/21/chartex" xmlns:cx1="http://schemas.microsoft.com/office/drawing/2015/9/8/chartex" xmlns:cx="http://schemas.microsoft.com/office/drawing/2014/chartex">
             <w:pict>
               <v:group id="Zone de dessin 12" style="position:absolute;margin-left:.2pt;margin-top:3.95pt;width:496.15pt;height:14.85pt;z-index:-251656192" coordsize="63011,1885" o:spid="_x0000_s1026" editas="canvas" w14:anchorId="354475EC" o:gfxdata="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">
                 <v:shape id="_x0000_s1027" style="position:absolute;width:63011;height:1885;visibility:visible;mso-wrap-style:square" type="#_x0000_t75">
@@ -1077,9 +1076,9 @@
           <w:lang w:val="en-US"/>
         </w:rPr>
       </w:pPr>
-      <w:bookmarkStart w:id="4" w:name="GRAPH"/>
-    </w:p>
-    <w:bookmarkEnd w:id="4"/>
+      <w:bookmarkStart w:id="3" w:name="GRAPH"/>
+    </w:p>
+    <w:bookmarkEnd w:id="3"/>
     <w:p>
       <w:pPr>
         <w:rPr>
@@ -1285,7 +1284,7 @@
               </wp:anchor>
             </w:drawing>
           </mc:Choice>
-          <mc:Fallback xmlns:cx="http://schemas.microsoft.com/office/drawing/2014/chartex" xmlns:cx1="http://schemas.microsoft.com/office/drawing/2015/9/8/chartex" xmlns:cx2="http://schemas.microsoft.com/office/drawing/2015/10/21/chartex" xmlns:cx3="http://schemas.microsoft.com/office/drawing/2016/5/9/chartex" xmlns:cx4="http://schemas.microsoft.com/office/drawing/2016/5/10/chartex" xmlns:cx5="http://schemas.microsoft.com/office/drawing/2016/5/11/chartex" xmlns:cx6="http://schemas.microsoft.com/office/drawing/2016/5/12/chartex" xmlns:cx7="http://schemas.microsoft.com/office/drawing/2016/5/13/chartex" xmlns:cx8="http://schemas.microsoft.com/office/drawing/2016/5/14/chartex" xmlns:aink="http://schemas.microsoft.com/office/drawing/2016/ink" xmlns:am3d="http://schemas.microsoft.com/office/drawing/2017/model3d" xmlns:w16cex="http://schemas.microsoft.com/office/word/2018/wordml/cex" xmlns:w16cid="http://schemas.microsoft.com/office/word/2016/wordml/cid" xmlns:w16="http://schemas.microsoft.com/office/word/2018/wordml" xmlns:w16sdtdh="http://schemas.microsoft.com/office/word/2020/wordml/sdtdatahash" xmlns:w16se="http://schemas.microsoft.com/office/word/2015/wordml/symex" xmlns:a="http://schemas.openxmlformats.org/drawingml/2006/main" xmlns:a14="http://schemas.microsoft.com/office/drawing/2010/main" xmlns:w16sdtfl="http://schemas.microsoft.com/office/word/2024/wordml/sdtformatlock" xmlns:w16du="http://schemas.microsoft.com/office/word/2023/wordml/word16du" xmlns:oel="http://schemas.microsoft.com/office/2019/extlst">
+          <mc:Fallback xmlns:oel="http://schemas.microsoft.com/office/2019/extlst" xmlns:w16du="http://schemas.microsoft.com/office/word/2023/wordml/word16du" xmlns:w16sdtfl="http://schemas.microsoft.com/office/word/2024/wordml/sdtformatlock" xmlns:a14="http://schemas.microsoft.com/office/drawing/2010/main" xmlns:a="http://schemas.openxmlformats.org/drawingml/2006/main" xmlns:w16se="http://schemas.microsoft.com/office/word/2015/wordml/symex" xmlns:w16sdtdh="http://schemas.microsoft.com/office/word/2020/wordml/sdtdatahash" xmlns:w16="http://schemas.microsoft.com/office/word/2018/wordml" xmlns:w16cid="http://schemas.microsoft.com/office/word/2016/wordml/cid" xmlns:w16cex="http://schemas.microsoft.com/office/word/2018/wordml/cex" xmlns:am3d="http://schemas.microsoft.com/office/drawing/2017/model3d" xmlns:aink="http://schemas.microsoft.com/office/drawing/2016/ink" xmlns:cx8="http://schemas.microsoft.com/office/drawing/2016/5/14/chartex" xmlns:cx7="http://schemas.microsoft.com/office/drawing/2016/5/13/chartex" xmlns:cx6="http://schemas.microsoft.com/office/drawing/2016/5/12/chartex" xmlns:cx5="http://schemas.microsoft.com/office/drawing/2016/5/11/chartex" xmlns:cx4="http://schemas.microsoft.com/office/drawing/2016/5/10/chartex" xmlns:cx3="http://schemas.microsoft.com/office/drawing/2016/5/9/chartex" xmlns:cx2="http://schemas.microsoft.com/office/drawing/2015/10/21/chartex" xmlns:cx1="http://schemas.microsoft.com/office/drawing/2015/9/8/chartex" xmlns:cx="http://schemas.microsoft.com/office/drawing/2014/chartex">
             <w:pict>
               <v:group id="Zone de dessin 18" style="position:absolute;margin-left:1.1pt;margin-top:3.6pt;width:496.15pt;height:14.85pt;z-index:-251658240" coordsize="63011,1885" o:spid="_x0000_s1026" editas="canvas" w14:anchorId="6A143A95" o:gfxdata="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">
                 <v:shape id="_x0000_s1027" style="position:absolute;width:63011;height:1885;visibility:visible;mso-wrap-style:square" type="#_x0000_t75">
@@ -1905,8 +1904,8 @@
                 <w:lang w:val="en-US"/>
               </w:rPr>
             </w:pPr>
-            <w:bookmarkStart w:id="5" w:name="TECHNO_ROW"/>
-            <w:bookmarkEnd w:id="5"/>
+            <w:bookmarkStart w:id="4" w:name="TECHNO_ROW"/>
+            <w:bookmarkEnd w:id="4"/>
             <w:proofErr w:type="spellStart"/>
             <w:r>
               <w:rPr>
@@ -9036,6 +9035,8 @@
       <w:headerReference w:type="default" r:id="rId13"/>
       <w:footerReference w:type="even" r:id="rId14"/>
       <w:footerReference w:type="default" r:id="rId15"/>
+      <w:headerReference w:type="first" r:id="rId16"/>
+      <w:footerReference w:type="first" r:id="rId17"/>
       <w:pgSz w:w="11900" w:h="16840"/>
       <w:pgMar w:top="709" w:right="987" w:bottom="1418" w:left="992" w:header="680" w:footer="448" w:gutter="0"/>
       <w:pgNumType w:start="1"/>
@@ -9239,7 +9240,7 @@
             </wp:anchor>
           </w:drawing>
         </mc:Choice>
-        <mc:Fallback xmlns:cx="http://schemas.microsoft.com/office/drawing/2014/chartex" xmlns:cx1="http://schemas.microsoft.com/office/drawing/2015/9/8/chartex" xmlns:cx2="http://schemas.microsoft.com/office/drawing/2015/10/21/chartex" xmlns:cx3="http://schemas.microsoft.com/office/drawing/2016/5/9/chartex" xmlns:cx4="http://schemas.microsoft.com/office/drawing/2016/5/10/chartex" xmlns:cx5="http://schemas.microsoft.com/office/drawing/2016/5/11/chartex" xmlns:cx6="http://schemas.microsoft.com/office/drawing/2016/5/12/chartex" xmlns:cx7="http://schemas.microsoft.com/office/drawing/2016/5/13/chartex" xmlns:cx8="http://schemas.microsoft.com/office/drawing/2016/5/14/chartex" xmlns:aink="http://schemas.microsoft.com/office/drawing/2016/ink" xmlns:am3d="http://schemas.microsoft.com/office/drawing/2017/model3d" xmlns:w16cex="http://schemas.microsoft.com/office/word/2018/wordml/cex" xmlns:w16cid="http://schemas.microsoft.com/office/word/2016/wordml/cid" xmlns:w16="http://schemas.microsoft.com/office/word/2018/wordml" xmlns:w16sdtdh="http://schemas.microsoft.com/office/word/2020/wordml/sdtdatahash" xmlns:w16se="http://schemas.microsoft.com/office/word/2015/wordml/symex" xmlns:a="http://schemas.openxmlformats.org/drawingml/2006/main" xmlns:a14="http://schemas.microsoft.com/office/drawing/2010/main" xmlns:w16sdtfl="http://schemas.microsoft.com/office/word/2024/wordml/sdtformatlock" xmlns:w16du="http://schemas.microsoft.com/office/word/2023/wordml/word16du" xmlns:oel="http://schemas.microsoft.com/office/2019/extlst">
+        <mc:Fallback xmlns:oel="http://schemas.microsoft.com/office/2019/extlst" xmlns:w16du="http://schemas.microsoft.com/office/word/2023/wordml/word16du" xmlns:w16sdtfl="http://schemas.microsoft.com/office/word/2024/wordml/sdtformatlock" xmlns:a14="http://schemas.microsoft.com/office/drawing/2010/main" xmlns:a="http://schemas.openxmlformats.org/drawingml/2006/main" xmlns:w16se="http://schemas.microsoft.com/office/word/2015/wordml/symex" xmlns:w16sdtdh="http://schemas.microsoft.com/office/word/2020/wordml/sdtdatahash" xmlns:w16="http://schemas.microsoft.com/office/word/2018/wordml" xmlns:w16cid="http://schemas.microsoft.com/office/word/2016/wordml/cid" xmlns:w16cex="http://schemas.microsoft.com/office/word/2018/wordml/cex" xmlns:am3d="http://schemas.microsoft.com/office/drawing/2017/model3d" xmlns:aink="http://schemas.microsoft.com/office/drawing/2016/ink" xmlns:cx8="http://schemas.microsoft.com/office/drawing/2016/5/14/chartex" xmlns:cx7="http://schemas.microsoft.com/office/drawing/2016/5/13/chartex" xmlns:cx6="http://schemas.microsoft.com/office/drawing/2016/5/12/chartex" xmlns:cx5="http://schemas.microsoft.com/office/drawing/2016/5/11/chartex" xmlns:cx4="http://schemas.microsoft.com/office/drawing/2016/5/10/chartex" xmlns:cx3="http://schemas.microsoft.com/office/drawing/2016/5/9/chartex" xmlns:cx2="http://schemas.microsoft.com/office/drawing/2015/10/21/chartex" xmlns:cx1="http://schemas.microsoft.com/office/drawing/2015/9/8/chartex" xmlns:cx="http://schemas.microsoft.com/office/drawing/2014/chartex">
           <w:pict>
             <v:group id="Zone de dessin 1" style="position:absolute;margin-left:.55pt;margin-top:4.55pt;width:496.15pt;height:14.85pt;z-index:-251657216" coordsize="63011,1885" o:spid="_x0000_s1026" editas="canvas" w14:anchorId="66D31374" o:gfxdata="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">
               <v:shapetype id="_x0000_t75" coordsize="21600,21600" filled="f" stroked="f" o:spt="75" o:preferrelative="t" path="m@4@5l@4@11@9@11@9@5xe">
@@ -9332,6 +9333,20 @@
             <w:rPr>
               <w:b/>
             </w:rPr>
+            <w:t xml:space="preserve">         </w:t>
+          </w:r>
+          <w:r>
+            <w:rPr>
+              <w:b/>
+            </w:rPr>
+            <w:t xml:space="preserve">   </w:t>
+          </w:r>
+          <w:bookmarkStart w:id="5" w:name="_GoBack"/>
+          <w:bookmarkEnd w:id="5"/>
+          <w:r>
+            <w:rPr>
+              <w:b/>
+            </w:rPr>
             <w:t>Page</w:t>
           </w:r>
           <w:r>
@@ -9362,7 +9377,7 @@
             <w:rPr>
               <w:b/>
             </w:rPr>
-            <w:t>2</w:t>
+            <w:t>1</w:t>
           </w:r>
           <w:r>
             <w:rPr>
@@ -9400,8 +9415,11 @@
         <w:p>
           <w:pPr>
             <w:pStyle w:val="NORMALTABLEAU"/>
-            <w:jc w:val="right"/>
+            <w:jc w:val="center"/>
           </w:pPr>
+          <w:r>
+            <w:t xml:space="preserve">             </w:t>
+          </w:r>
           <w:r>
             <w:t>ALTEN_DCA</w:t>
           </w:r>
@@ -9415,6 +9433,16 @@
   <w:p/>
   <w:p/>
   <w:p/>
+</w:ftr>
+</file>
+
+<file path=word/footer3.xml><?xml version="1.0" encoding="utf-8"?>
+<w:ftr xmlns:wpc="http://schemas.microsoft.com/office/word/2010/wordprocessingCanvas" xmlns:mc="http://schemas.openxmlformats.org/markup-compatibility/2006" xmlns:o="urn:schemas-microsoft-com:office:office" xmlns:r="http://schemas.openxmlformats.org/officeDocument/2006/relationships" xmlns:m="http://schemas.openxmlformats.org/officeDocument/2006/math" xmlns:v="urn:schemas-microsoft-com:vml" xmlns:wp14="http://schemas.microsoft.com/office/word/2010/wordprocessingDrawing" xmlns:wp="http://schemas.openxmlformats.org/drawingml/2006/wordprocessingDrawing" xmlns:w10="urn:schemas-microsoft-com:office:word" xmlns:w="http://schemas.openxmlformats.org/wordprocessingml/2006/main" xmlns:w14="http://schemas.microsoft.com/office/word/2010/wordml" xmlns:w15="http://schemas.microsoft.com/office/word/2012/wordml" xmlns:wpg="http://schemas.microsoft.com/office/word/2010/wordprocessingGroup" xmlns:wpi="http://schemas.microsoft.com/office/word/2010/wordprocessingInk" xmlns:wne="http://schemas.microsoft.com/office/word/2006/wordml" xmlns:wps="http://schemas.microsoft.com/office/word/2010/wordprocessingShape" mc:Ignorable="w14 w15 wp14">
+  <w:p>
+    <w:pPr>
+      <w:pStyle w:val="Footer"/>
+    </w:pPr>
+  </w:p>
 </w:ftr>
 </file>
 
@@ -9511,6 +9539,16 @@
 </w:hdr>
 </file>
 
+<file path=word/header3.xml><?xml version="1.0" encoding="utf-8"?>
+<w:hdr xmlns:wpc="http://schemas.microsoft.com/office/word/2010/wordprocessingCanvas" xmlns:mc="http://schemas.openxmlformats.org/markup-compatibility/2006" xmlns:o="urn:schemas-microsoft-com:office:office" xmlns:r="http://schemas.openxmlformats.org/officeDocument/2006/relationships" xmlns:m="http://schemas.openxmlformats.org/officeDocument/2006/math" xmlns:v="urn:schemas-microsoft-com:vml" xmlns:wp14="http://schemas.microsoft.com/office/word/2010/wordprocessingDrawing" xmlns:wp="http://schemas.openxmlformats.org/drawingml/2006/wordprocessingDrawing" xmlns:w10="urn:schemas-microsoft-com:office:word" xmlns:w="http://schemas.openxmlformats.org/wordprocessingml/2006/main" xmlns:w14="http://schemas.microsoft.com/office/word/2010/wordml" xmlns:w15="http://schemas.microsoft.com/office/word/2012/wordml" xmlns:wpg="http://schemas.microsoft.com/office/word/2010/wordprocessingGroup" xmlns:wpi="http://schemas.microsoft.com/office/word/2010/wordprocessingInk" xmlns:wne="http://schemas.microsoft.com/office/word/2006/wordml" xmlns:wps="http://schemas.microsoft.com/office/word/2010/wordprocessingShape" mc:Ignorable="w14 w15 wp14">
+  <w:p>
+    <w:pPr>
+      <w:pStyle w:val="Header"/>
+    </w:pPr>
+  </w:p>
+</w:hdr>
+</file>
+
 <file path=word/numbering.xml><?xml version="1.0" encoding="utf-8"?>
 <w:numbering xmlns:wpc="http://schemas.microsoft.com/office/word/2010/wordprocessingCanvas" xmlns:mc="http://schemas.openxmlformats.org/markup-compatibility/2006" xmlns:o="urn:schemas-microsoft-com:office:office" xmlns:r="http://schemas.openxmlformats.org/officeDocument/2006/relationships" xmlns:m="http://schemas.openxmlformats.org/officeDocument/2006/math" xmlns:v="urn:schemas-microsoft-com:vml" xmlns:wp14="http://schemas.microsoft.com/office/word/2010/wordprocessingDrawing" xmlns:wp="http://schemas.openxmlformats.org/drawingml/2006/wordprocessingDrawing" xmlns:w10="urn:schemas-microsoft-com:office:word" xmlns:w="http://schemas.openxmlformats.org/wordprocessingml/2006/main" xmlns:w14="http://schemas.microsoft.com/office/word/2010/wordml" xmlns:w15="http://schemas.microsoft.com/office/word/2012/wordml" xmlns:wpg="http://schemas.microsoft.com/office/word/2010/wordprocessingGroup" xmlns:wpi="http://schemas.microsoft.com/office/word/2010/wordprocessingInk" xmlns:wne="http://schemas.microsoft.com/office/word/2006/wordml" xmlns:wps="http://schemas.microsoft.com/office/word/2010/wordprocessingShape" mc:Ignorable="w14 w15 wp14">
   <w:numPicBullet w:numPicBulletId="0">
@@ -9534,28 +9572,28 @@
         <v:path o:extrusionok="f" gradientshapeok="t" o:connecttype="rect"/>
         <o:lock v:ext="edit" aspectratio="t"/>
       </v:shapetype>
-      <v:shape id="_x0000_i1036" type="#_x0000_t75" style="width:43pt;height:43pt;visibility:visible;mso-wrap-style:square" o:bullet="t">
+      <v:shape id="_x0000_i1038" type="#_x0000_t75" style="width:43.2pt;height:43.2pt;visibility:visible;mso-wrap-style:square" o:bullet="t">
         <v:imagedata r:id="rId1" o:title=""/>
       </v:shape>
     </w:pict>
   </w:numPicBullet>
   <w:numPicBullet w:numPicBulletId="1">
     <w:pict>
-      <v:shape id="_x0000_i1037" type="#_x0000_t75" style="width:65pt;height:43pt;visibility:visible;mso-wrap-style:square" o:bullet="t">
+      <v:shape w14:anchorId="69CE8F46" id="_x0000_i1039" type="#_x0000_t75" style="width:65.1pt;height:43.2pt;visibility:visible;mso-wrap-style:square" o:bullet="t">
         <v:imagedata r:id="rId2" o:title=""/>
       </v:shape>
     </w:pict>
   </w:numPicBullet>
   <w:numPicBullet w:numPicBulletId="2">
     <w:pict>
-      <v:shape id="_x0000_i1038" type="#_x0000_t75" style="width:43pt;height:43pt;visibility:visible;mso-wrap-style:square" o:bullet="t">
+      <v:shape id="_x0000_i1040" type="#_x0000_t75" style="width:43.2pt;height:43.2pt;visibility:visible;mso-wrap-style:square" o:bullet="t">
         <v:imagedata r:id="rId3" o:title=""/>
       </v:shape>
     </w:pict>
   </w:numPicBullet>
   <w:numPicBullet w:numPicBulletId="3">
     <w:pict>
-      <v:shape id="_x0000_i1039" type="#_x0000_t75" style="width:7pt;height:8pt;visibility:visible;mso-wrap-style:square" o:bullet="t">
+      <v:shape id="_x0000_i1041" type="#_x0000_t75" style="width:6.9pt;height:8.05pt;visibility:visible;mso-wrap-style:square" o:bullet="t">
         <v:imagedata r:id="rId4" o:title=""/>
       </v:shape>
     </w:pict>
@@ -16943,16 +16981,16 @@
 </file>
 
 <file path=customXml/item2.xml><?xml version="1.0" encoding="utf-8"?>
+<LongProperties xmlns="http://schemas.microsoft.com/office/2006/metadata/longProperties"/>
+</file>
+
+<file path=customXml/item3.xml><?xml version="1.0" encoding="utf-8"?>
 <?mso-contentType ?>
 <FormTemplates xmlns="http://schemas.microsoft.com/sharepoint/v3/contenttype/forms">
   <Display>DocumentLibraryForm</Display>
   <Edit>DocumentLibraryForm</Edit>
   <New>DocumentLibraryForm</New>
 </FormTemplates>
-</file>
-
-<file path=customXml/item3.xml><?xml version="1.0" encoding="utf-8"?>
-<LongProperties xmlns="http://schemas.microsoft.com/office/2006/metadata/longProperties"/>
 </file>
 
 <file path=customXml/item4.xml><?xml version="1.0" encoding="utf-8"?>
@@ -16977,6 +17015,14 @@
 </file>
 
 <file path=customXml/itemProps2.xml><?xml version="1.0" encoding="utf-8"?>
+<ds:datastoreItem xmlns:ds="http://schemas.openxmlformats.org/officeDocument/2006/customXml" ds:itemID="{647C7A8F-9755-42A0-844B-4AD918516A30}">
+  <ds:schemaRefs>
+    <ds:schemaRef ds:uri="http://schemas.microsoft.com/office/2006/metadata/longProperties"/>
+  </ds:schemaRefs>
+</ds:datastoreItem>
+</file>
+
+<file path=customXml/itemProps3.xml><?xml version="1.0" encoding="utf-8"?>
 <ds:datastoreItem xmlns:ds="http://schemas.openxmlformats.org/officeDocument/2006/customXml" ds:itemID="{BECD7B25-234A-48C9-B7A9-A41EEFC8D1DD}">
   <ds:schemaRefs>
     <ds:schemaRef ds:uri="http://schemas.microsoft.com/sharepoint/v3/contenttype/forms"/>
@@ -16984,16 +17030,8 @@
 </ds:datastoreItem>
 </file>
 
-<file path=customXml/itemProps3.xml><?xml version="1.0" encoding="utf-8"?>
-<ds:datastoreItem xmlns:ds="http://schemas.openxmlformats.org/officeDocument/2006/customXml" ds:itemID="{647C7A8F-9755-42A0-844B-4AD918516A30}">
-  <ds:schemaRefs>
-    <ds:schemaRef ds:uri="http://schemas.microsoft.com/office/2006/metadata/longProperties"/>
-  </ds:schemaRefs>
-</ds:datastoreItem>
-</file>
-
 <file path=customXml/itemProps4.xml><?xml version="1.0" encoding="utf-8"?>
-<ds:datastoreItem xmlns:ds="http://schemas.openxmlformats.org/officeDocument/2006/customXml" ds:itemID="{0DE6370C-79B7-4697-9F11-D50E37FE6B89}">
+<ds:datastoreItem xmlns:ds="http://schemas.openxmlformats.org/officeDocument/2006/customXml" ds:itemID="{E974F1FA-33C8-41EC-A0D5-9ECB76277E5E}">
   <ds:schemaRefs>
     <ds:schemaRef ds:uri="http://schemas.openxmlformats.org/officeDocument/2006/bibliography"/>
   </ds:schemaRefs>

</xml_diff>